<commit_message>
Desvíos: guía de operarios con la pregunta de causa; función actualizarGuia
Co-Authored-By: Claude Opus 5.5 <noreply@anthropic.com>
Claude-Session: https://claude.ai/code/session_01Hi4tz6dvxUjWs3cSrjXKc8
</commit_message>
<xml_diff>
--- a/desvios/impresion/Guia_registro_desvios_HMH_v0.docx
+++ b/desvios/impresion/Guia_registro_desvios_HMH_v0.docx
@@ -51,7 +51,7 @@
           <w:color w:val="6B7780"/>
           <w:sz w:val="18"/>
         </w:rPr>
-        <w:t>Versión 0 · octubre de 2026 · Servicio de Higiene y Seguridad Laboral HZT / HMH</w:t>
+        <w:t>Versión 0 (actualizada el 22/10/2026) · Servicio de Higiene y Seguridad Laboral HZT / HMH</w:t>
       </w:r>
     </w:p>
     <w:p>
@@ -218,6 +218,28 @@
           <w:color w:val="3D4A52"/>
         </w:rPr>
         <w:t>Marcá una o varias opciones. Las de cortopunzantes se ven en rojo porque llegan como urgentes.</w:t>
+      </w:r>
+    </w:p>
+    <w:p>
+      <w:pPr>
+        <w:pStyle w:val="ListNumber"/>
+        <w:spacing w:line="312" w:lineRule="auto"/>
+        <w:jc w:val="left"/>
+      </w:pPr>
+      <w:r>
+        <w:rPr>
+          <w:rFonts w:ascii="Plus Jakarta Sans" w:hAnsi="Plus Jakarta Sans"/>
+          <w:b/>
+          <w:color w:val="3D4A52"/>
+        </w:rPr>
+        <w:t xml:space="preserve">Por qué pasó. </w:t>
+      </w:r>
+      <w:r>
+        <w:rPr>
+          <w:rFonts w:ascii="Plus Jakarta Sans" w:hAnsi="Plus Jakarta Sans"/>
+          <w:color w:val="3D4A52"/>
+        </w:rPr>
+        <w:t>Si marcaste «Contenedor lleno» o «Residuo fuera de contenedor», la página pregunta por qué. Mirá todos los contenedores del lugar: si no había lugar en ninguno, marcá «No había lugar: todos los contenedores estaban llenos». Así se sabe que faltan contenedores y no que el servicio los dejó mal. Si podés, anotá cuántos contenedores hay y cuántos estaban llenos.</w:t>
       </w:r>
     </w:p>
     <w:p>
@@ -430,7 +452,7 @@
                 <w:color w:val="3D4A52"/>
                 <w:sz w:val="19"/>
               </w:rPr>
-              <w:t>Bolsas rojas o negras en el piso; tacho vacío y bolsa al lado.</w:t>
+              <w:t>Bolsas rojas o negras en el piso o encima de los tachos; tacho vacío y bolsa al lado. También se pregunta por qué pasó.</w:t>
             </w:r>
           </w:p>
         </w:tc>
@@ -556,7 +578,7 @@
                 <w:color w:val="3D4A52"/>
                 <w:sz w:val="19"/>
               </w:rPr>
-              <w:t>Tacho rebalsado; cajas de cartón usadas como contenedor.</w:t>
+              <w:t>Tacho rebalsado; cajas de cartón usadas como contenedor. En «lleno» se pregunta por qué: no había lugar en ningún contenedor, había lugar y no se usó, contenedor roto o sin bolsa, o el retiro se demoró.</w:t>
             </w:r>
           </w:p>
         </w:tc>

</xml_diff>

<commit_message>
Desvíos: guía de operarios con la revisión de desvíos anteriores y el aviso de aislamiento
Co-Authored-By: Claude Opus 5.5 <noreply@anthropic.com>
Claude-Session: https://claude.ai/code/session_01Hi4tz6dvxUjWs3cSrjXKc8
</commit_message>
<xml_diff>
--- a/desvios/impresion/Guia_registro_desvios_HMH_v0.docx
+++ b/desvios/impresion/Guia_registro_desvios_HMH_v0.docx
@@ -210,6 +210,28 @@
           <w:b/>
           <w:color w:val="3D4A52"/>
         </w:rPr>
+        <w:t xml:space="preserve">Antes se registró en este lugar. </w:t>
+      </w:r>
+      <w:r>
+        <w:rPr>
+          <w:rFonts w:ascii="Plus Jakarta Sans" w:hAnsi="Plus Jakarta Sans"/>
+          <w:color w:val="3D4A52"/>
+        </w:rPr>
+        <w:t>Si en ese lugar ya hay un desvío en el que Higiene y Seguridad tomó una medida, la página te lo muestra. Mirá y marcá «Sigue igual» o «Ya está corregido». Si no hay nada nuevo para registrar, tocá «Enviar solo la revisión».</w:t>
+      </w:r>
+    </w:p>
+    <w:p>
+      <w:pPr>
+        <w:pStyle w:val="ListNumber"/>
+        <w:spacing w:line="312" w:lineRule="auto"/>
+        <w:jc w:val="left"/>
+      </w:pPr>
+      <w:r>
+        <w:rPr>
+          <w:rFonts w:ascii="Plus Jakarta Sans" w:hAnsi="Plus Jakarta Sans"/>
+          <w:b/>
+          <w:color w:val="3D4A52"/>
+        </w:rPr>
         <w:t xml:space="preserve">Qué viste. </w:t>
       </w:r>
       <w:r>
@@ -240,6 +262,28 @@
           <w:color w:val="3D4A52"/>
         </w:rPr>
         <w:t>Si marcaste «Contenedor lleno» o «Residuo fuera de contenedor», la página pregunta por qué. Mirá todos los contenedores del lugar: si no había lugar en ninguno, marcá «No había lugar: todos los contenedores estaban llenos». Así se sabe que faltan contenedores y no que el servicio los dejó mal. Si podés, anotá cuántos contenedores hay y cuántos estaban llenos.</w:t>
+      </w:r>
+    </w:p>
+    <w:p>
+      <w:pPr>
+        <w:pStyle w:val="ListNumber"/>
+        <w:spacing w:line="312" w:lineRule="auto"/>
+        <w:jc w:val="left"/>
+      </w:pPr>
+      <w:r>
+        <w:rPr>
+          <w:rFonts w:ascii="Plus Jakarta Sans" w:hAnsi="Plus Jakarta Sans"/>
+          <w:b/>
+          <w:color w:val="3D4A52"/>
+        </w:rPr>
+        <w:t xml:space="preserve">Aislamientos. </w:t>
+      </w:r>
+      <w:r>
+        <w:rPr>
+          <w:rFonts w:ascii="Plus Jakarta Sans" w:hAnsi="Plus Jakarta Sans"/>
+          <w:color w:val="3D4A52"/>
+        </w:rPr>
+        <w:t>Si marcaste «Segregación incorrecta» o «Bolsa incorrecta», la página recuerda que todo lo que sale de un aislamiento por enfermedad infectocontagiosa, incluida la comida, va en bolsa roja (no es un error), y pregunta si venía de un aislamiento. En el aislamiento inverso o protector se separa como siempre.</w:t>
       </w:r>
     </w:p>
     <w:p>
@@ -494,7 +538,7 @@
                 <w:color w:val="3D4A52"/>
                 <w:sz w:val="19"/>
               </w:rPr>
-              <w:t>Bandejas de comida en bolsa roja; residuo con sangre en bolsa negra.</w:t>
+              <w:t>Residuo con sangre en bolsa negra; bandejas de comida en bolsa roja (salvo que vengan de un aislamiento por enfermedad infectocontagiosa: ahí la bolsa roja es lo correcto).</w:t>
             </w:r>
           </w:p>
         </w:tc>

</xml_diff>